<commit_message>
Installation Manual: new vault password per install; view, rekey, lost-password steps
Co-Authored-By: Claude Opus 5.5 <noreply@anthropic.com>
</commit_message>
<xml_diff>
--- a/docs/ISP Network Observability Platform - Installation Manual.docx
+++ b/docs/ISP Network Observability Platform - Installation Manual.docx
@@ -155,7 +155,7 @@
           </w:tcPr>
           <w:p>
             <w:r>
-              <w:t xml:space="preserve">1.0, 29 October 2026</w:t>
+              <w:t xml:space="preserve">1.1, 29 October 2026</w:t>
             </w:r>
           </w:p>
         </w:tc>
@@ -4151,7 +4151,33 @@
         <w:t xml:space="preserve">ansible/secrets.yml</w:t>
       </w:r>
       <w:r>
-        <w:t xml:space="preserve">, committed to git. The password that opens it is kept in the macOS Keychain so no deploy asks for it. Store it in the Keychain:</w:t>
+        <w:t xml:space="preserve">, committed to git. The password that opens it is kept in the macOS Keychain, so no deploy or edit asks for it. It is only ever used on the laptop; the server never sees the vault or its password.</w:t>
+      </w:r>
+    </w:p>
+    <w:p>
+      <w:pPr>
+        <w:pStyle w:val="Heading2"/>
+        <w:keepNext/>
+        <w:spacing w:before="240" w:after="120"/>
+      </w:pPr>
+      <w:r>
+        <w:t xml:space="preserve">6.1 A new password for every new installation</w:t>
+      </w:r>
+    </w:p>
+    <w:p>
+      <w:pPr>
+        <w:spacing w:after="120"/>
+      </w:pPr>
+      <w:r>
+        <w:t xml:space="preserve">A production server gets its own vault password. Never reuse one from a lab or test install: anyone who knew the test password could open the production secrets.</w:t>
+      </w:r>
+    </w:p>
+    <w:p>
+      <w:pPr>
+        <w:spacing w:after="120"/>
+      </w:pPr>
+      <w:r>
+        <w:t xml:space="preserve">Check whether the laptop already has a vault password stored (for example from a lab test):</w:t>
       </w:r>
     </w:p>
     <w:p>
@@ -4184,6 +4210,96 @@
           <w:sz w:val="18"/>
           <w:szCs w:val="18"/>
         </w:rPr>
+        <w:t xml:space="preserve">security find-generic-password -a "$USER" -s isp-observability-vault -w</w:t>
+      </w:r>
+    </w:p>
+    <w:p>
+      <w:pPr>
+        <w:spacing w:after="120"/>
+      </w:pPr>
+      <w:r>
+        <w:t xml:space="preserve">It prints the stored password (macOS may ask for your login password first), or says "could not be found" if there is none. Do not paste the output into chat, email or tickets.</w:t>
+      </w:r>
+    </w:p>
+    <w:p>
+      <w:pPr>
+        <w:keepNext/>
+        <w:spacing w:before="80" w:after="0"/>
+      </w:pPr>
+      <w:r>
+        <w:rPr>
+          <w:i/>
+          <w:iCs/>
+          <w:color w:val="5B6475"/>
+          <w:sz w:val="17"/>
+          <w:szCs w:val="17"/>
+        </w:rPr>
+        <w:t xml:space="preserve">Laptop (if a lab or test vault exists)</w:t>
+      </w:r>
+    </w:p>
+    <w:p>
+      <w:pPr>
+        <w:keepNext w:val="false"/>
+        <w:keepLines/>
+        <w:shd w:fill="F1F5F9" w:color="auto" w:val="clear"/>
+        <w:spacing w:before="0" w:after="140"/>
+        <w:ind w:left="120" w:right="120"/>
+      </w:pPr>
+      <w:r>
+        <w:rPr>
+          <w:rFonts w:ascii="Consolas" w:cs="Consolas" w:eastAsia="Consolas" w:hAnsi="Consolas"/>
+          <w:sz w:val="18"/>
+          <w:szCs w:val="18"/>
+        </w:rPr>
+        <w:t xml:space="preserve">mv ansible/secrets.yml ansible/secrets.lab.yml     # only if a lab vault exists</w:t>
+      </w:r>
+    </w:p>
+    <w:p>
+      <w:pPr>
+        <w:spacing w:after="120"/>
+      </w:pPr>
+      <w:r>
+        <w:t xml:space="preserve">Moves an old vault aside so section 7 starts a fresh one. Never commit the lab file. Once the old password is replaced (next step) the lab vault no longer opens without typing its old password.</w:t>
+      </w:r>
+    </w:p>
+    <w:p>
+      <w:pPr>
+        <w:spacing w:after="120"/>
+      </w:pPr>
+      <w:r>
+        <w:t xml:space="preserve">Choose a new long random password (for example 30+ characters from the password manager's generator) and store it in the Keychain:</w:t>
+      </w:r>
+    </w:p>
+    <w:p>
+      <w:pPr>
+        <w:keepNext/>
+        <w:spacing w:before="80" w:after="0"/>
+      </w:pPr>
+      <w:r>
+        <w:rPr>
+          <w:i/>
+          <w:iCs/>
+          <w:color w:val="5B6475"/>
+          <w:sz w:val="17"/>
+          <w:szCs w:val="17"/>
+        </w:rPr>
+        <w:t xml:space="preserve">Laptop</w:t>
+      </w:r>
+    </w:p>
+    <w:p>
+      <w:pPr>
+        <w:keepNext w:val="false"/>
+        <w:keepLines/>
+        <w:shd w:fill="F1F5F9" w:color="auto" w:val="clear"/>
+        <w:spacing w:before="0" w:after="140"/>
+        <w:ind w:left="120" w:right="120"/>
+      </w:pPr>
+      <w:r>
+        <w:rPr>
+          <w:rFonts w:ascii="Consolas" w:cs="Consolas" w:eastAsia="Consolas" w:hAnsi="Consolas"/>
+          <w:sz w:val="18"/>
+          <w:szCs w:val="18"/>
+        </w:rPr>
         <w:t xml:space="preserve">security add-generic-password -U -a "$USER" -s isp-observability-vault -w</w:t>
       </w:r>
     </w:p>
@@ -4204,7 +4320,19 @@
         <w:t xml:space="preserve">-U</w:t>
       </w:r>
       <w:r>
-        <w:t xml:space="preserve"> replaces an earlier entry (for example one left from a lab test).</w:t>
+        <w:t xml:space="preserve"> replaces an existing entry. Check it with the </w:t>
+      </w:r>
+      <w:r>
+        <w:rPr>
+          <w:rFonts w:ascii="Consolas" w:cs="Consolas" w:eastAsia="Consolas" w:hAnsi="Consolas"/>
+          <w:color w:val="1F3A6B"/>
+          <w:sz w:val="19"/>
+          <w:szCs w:val="19"/>
+        </w:rPr>
+        <w:t xml:space="preserve">find-generic-password</w:t>
+      </w:r>
+      <w:r>
+        <w:t xml:space="preserve"> command above.</w:t>
       </w:r>
     </w:p>
     <w:p>
@@ -4224,7 +4352,7 @@
         <w:t xml:space="preserve">Important: </w:t>
       </w:r>
       <w:r>
-        <w:t xml:space="preserve">Save the same password in the company password manager now. The laptop is not a backup: without this password nobody can open the secrets, and every secret would have to be recreated.</w:t>
+        <w:t xml:space="preserve">Save the same password in the company password manager now, and make sure at least two people know where it is. The laptop is not a backup.</w:t>
       </w:r>
     </w:p>
     <w:p>
@@ -4244,7 +4372,17 @@
         <w:t xml:space="preserve">Note: </w:t>
       </w:r>
       <w:r>
-        <w:t xml:space="preserve">If the laptop already has an </w:t>
+        <w:t xml:space="preserve">Set the new password </w:t>
+      </w:r>
+      <w:r>
+        <w:rPr>
+          <w:b/>
+          <w:bCs/>
+        </w:rPr>
+        <w:t xml:space="preserve">before</w:t>
+      </w:r>
+      <w:r>
+        <w:t xml:space="preserve"> running </w:t>
       </w:r>
       <w:r>
         <w:rPr>
@@ -4253,23 +4391,384 @@
           <w:sz w:val="19"/>
           <w:szCs w:val="19"/>
         </w:rPr>
-        <w:t xml:space="preserve">ansible/secrets.yml</w:t>
-      </w:r>
-      <w:r>
-        <w:t xml:space="preserve"> from a lab or test server, move it aside first so you start clean: </w:t>
-      </w:r>
-      <w:r>
-        <w:rPr>
-          <w:rFonts w:ascii="Consolas" w:cs="Consolas" w:eastAsia="Consolas" w:hAnsi="Consolas"/>
-          <w:color w:val="1F3A6B"/>
-          <w:sz w:val="19"/>
-          <w:szCs w:val="19"/>
-        </w:rPr>
-        <w:t xml:space="preserve">mv ansible/secrets.yml ansible/secrets.lab.yml</w:t>
-      </w:r>
-      <w:r>
-        <w:t xml:space="preserve"> (never commit the lab file).</w:t>
-      </w:r>
+        <w:t xml:space="preserve">scripts/edit-secrets.sh</w:t>
+      </w:r>
+      <w:r>
+        <w:t xml:space="preserve"> in section 7: the vault is encrypted with whatever password the Keychain holds at that moment.</w:t>
+      </w:r>
+    </w:p>
+    <w:p>
+      <w:pPr>
+        <w:pStyle w:val="Heading2"/>
+        <w:keepNext/>
+        <w:spacing w:before="240" w:after="120"/>
+      </w:pPr>
+      <w:r>
+        <w:t xml:space="preserve">6.2 Later: another laptop, a new password, a lost password</w:t>
+      </w:r>
+    </w:p>
+    <w:tbl>
+      <w:tblPr>
+        <w:tblW w:type="dxa" w:w="9638"/>
+        <w:tblBorders>
+          <w:top w:val="single" w:color="auto" w:sz="4"/>
+          <w:left w:val="single" w:color="auto" w:sz="4"/>
+          <w:bottom w:val="single" w:color="auto" w:sz="4"/>
+          <w:right w:val="single" w:color="auto" w:sz="4"/>
+          <w:insideH w:val="single" w:color="auto" w:sz="4"/>
+          <w:insideV w:val="single" w:color="auto" w:sz="4"/>
+        </w:tblBorders>
+      </w:tblPr>
+      <w:tblGrid>
+        <w:gridCol w:w="2811"/>
+        <w:gridCol w:w="6827"/>
+      </w:tblGrid>
+      <w:tr>
+        <w:trPr>
+          <w:cantSplit/>
+          <w:tblHeader/>
+        </w:trPr>
+        <w:tc>
+          <w:tcPr>
+            <w:tcW w:type="dxa" w:w="2811"/>
+            <w:tcBorders>
+              <w:top w:val="single" w:color="auto" w:sz="4"/>
+              <w:left w:val="single" w:color="auto" w:sz="4"/>
+              <w:bottom w:val="single" w:color="auto" w:sz="4"/>
+              <w:right w:val="single" w:color="auto" w:sz="4"/>
+            </w:tcBorders>
+            <w:shd w:fill="0A4BCC" w:color="auto" w:val="clear"/>
+            <w:tcMar>
+              <w:top w:type="dxa" w:w="60"/>
+              <w:left w:type="dxa" w:w="100"/>
+              <w:bottom w:type="dxa" w:w="60"/>
+              <w:right w:type="dxa" w:w="100"/>
+            </w:tcMar>
+          </w:tcPr>
+          <w:p>
+            <w:r>
+              <w:rPr>
+                <w:b/>
+                <w:bCs/>
+                <w:color w:val="FFFFFF"/>
+              </w:rPr>
+              <w:t xml:space="preserve">Situation</w:t>
+            </w:r>
+          </w:p>
+        </w:tc>
+        <w:tc>
+          <w:tcPr>
+            <w:tcW w:type="dxa" w:w="6827"/>
+            <w:tcBorders>
+              <w:top w:val="single" w:color="auto" w:sz="4"/>
+              <w:left w:val="single" w:color="auto" w:sz="4"/>
+              <w:bottom w:val="single" w:color="auto" w:sz="4"/>
+              <w:right w:val="single" w:color="auto" w:sz="4"/>
+            </w:tcBorders>
+            <w:shd w:fill="0A4BCC" w:color="auto" w:val="clear"/>
+            <w:tcMar>
+              <w:top w:type="dxa" w:w="60"/>
+              <w:left w:type="dxa" w:w="100"/>
+              <w:bottom w:type="dxa" w:w="60"/>
+              <w:right w:type="dxa" w:w="100"/>
+            </w:tcMar>
+          </w:tcPr>
+          <w:p>
+            <w:r>
+              <w:rPr>
+                <w:b/>
+                <w:bCs/>
+                <w:color w:val="FFFFFF"/>
+              </w:rPr>
+              <w:t xml:space="preserve">What to do</w:t>
+            </w:r>
+          </w:p>
+        </w:tc>
+      </w:tr>
+      <w:tr>
+        <w:trPr>
+          <w:cantSplit/>
+        </w:trPr>
+        <w:tc>
+          <w:tcPr>
+            <w:tcW w:type="dxa" w:w="2811"/>
+            <w:tcBorders>
+              <w:top w:val="single" w:color="auto" w:sz="4"/>
+              <w:left w:val="single" w:color="auto" w:sz="4"/>
+              <w:bottom w:val="single" w:color="auto" w:sz="4"/>
+              <w:right w:val="single" w:color="auto" w:sz="4"/>
+            </w:tcBorders>
+            <w:tcMar>
+              <w:top w:type="dxa" w:w="60"/>
+              <w:left w:type="dxa" w:w="100"/>
+              <w:bottom w:type="dxa" w:w="60"/>
+              <w:right w:type="dxa" w:w="100"/>
+            </w:tcMar>
+          </w:tcPr>
+          <w:p>
+            <w:r>
+              <w:t xml:space="preserve">Another laptop or engineer</w:t>
+            </w:r>
+          </w:p>
+        </w:tc>
+        <w:tc>
+          <w:tcPr>
+            <w:tcW w:type="dxa" w:w="6827"/>
+            <w:tcBorders>
+              <w:top w:val="single" w:color="auto" w:sz="4"/>
+              <w:left w:val="single" w:color="auto" w:sz="4"/>
+              <w:bottom w:val="single" w:color="auto" w:sz="4"/>
+              <w:right w:val="single" w:color="auto" w:sz="4"/>
+            </w:tcBorders>
+            <w:tcMar>
+              <w:top w:type="dxa" w:w="60"/>
+              <w:left w:type="dxa" w:w="100"/>
+              <w:bottom w:type="dxa" w:w="60"/>
+              <w:right w:type="dxa" w:w="100"/>
+            </w:tcMar>
+          </w:tcPr>
+          <w:p>
+            <w:r>
+              <w:t xml:space="preserve">Clone the repository, then run the </w:t>
+            </w:r>
+            <w:r>
+              <w:rPr>
+                <w:rFonts w:ascii="Consolas" w:cs="Consolas" w:eastAsia="Consolas" w:hAnsi="Consolas"/>
+                <w:color w:val="1F3A6B"/>
+                <w:sz w:val="19"/>
+                <w:szCs w:val="19"/>
+              </w:rPr>
+              <w:t xml:space="preserve">add-generic-password</w:t>
+            </w:r>
+            <w:r>
+              <w:t xml:space="preserve"> command above once with the same password (from the password manager).</w:t>
+            </w:r>
+          </w:p>
+        </w:tc>
+      </w:tr>
+      <w:tr>
+        <w:trPr>
+          <w:cantSplit/>
+        </w:trPr>
+        <w:tc>
+          <w:tcPr>
+            <w:tcW w:type="dxa" w:w="2811"/>
+            <w:tcBorders>
+              <w:top w:val="single" w:color="auto" w:sz="4"/>
+              <w:left w:val="single" w:color="auto" w:sz="4"/>
+              <w:bottom w:val="single" w:color="auto" w:sz="4"/>
+              <w:right w:val="single" w:color="auto" w:sz="4"/>
+            </w:tcBorders>
+            <w:tcMar>
+              <w:top w:type="dxa" w:w="60"/>
+              <w:left w:type="dxa" w:w="100"/>
+              <w:bottom w:type="dxa" w:w="60"/>
+              <w:right w:type="dxa" w:w="100"/>
+            </w:tcMar>
+          </w:tcPr>
+          <w:p>
+            <w:r>
+              <w:t xml:space="preserve">Change the password (someone leaves, or it may have leaked)</w:t>
+            </w:r>
+          </w:p>
+        </w:tc>
+        <w:tc>
+          <w:tcPr>
+            <w:tcW w:type="dxa" w:w="6827"/>
+            <w:tcBorders>
+              <w:top w:val="single" w:color="auto" w:sz="4"/>
+              <w:left w:val="single" w:color="auto" w:sz="4"/>
+              <w:bottom w:val="single" w:color="auto" w:sz="4"/>
+              <w:right w:val="single" w:color="auto" w:sz="4"/>
+            </w:tcBorders>
+            <w:tcMar>
+              <w:top w:type="dxa" w:w="60"/>
+              <w:left w:type="dxa" w:w="100"/>
+              <w:bottom w:type="dxa" w:w="60"/>
+              <w:right w:type="dxa" w:w="100"/>
+            </w:tcMar>
+          </w:tcPr>
+          <w:p>
+            <w:r>
+              <w:t xml:space="preserve">From the </w:t>
+            </w:r>
+            <w:r>
+              <w:rPr>
+                <w:rFonts w:ascii="Consolas" w:cs="Consolas" w:eastAsia="Consolas" w:hAnsi="Consolas"/>
+                <w:color w:val="1F3A6B"/>
+                <w:sz w:val="19"/>
+                <w:szCs w:val="19"/>
+              </w:rPr>
+              <w:t xml:space="preserve">ansible/</w:t>
+            </w:r>
+            <w:r>
+              <w:t xml:space="preserve"> folder: </w:t>
+            </w:r>
+            <w:r>
+              <w:rPr>
+                <w:rFonts w:ascii="Consolas" w:cs="Consolas" w:eastAsia="Consolas" w:hAnsi="Consolas"/>
+                <w:color w:val="1F3A6B"/>
+                <w:sz w:val="19"/>
+                <w:szCs w:val="19"/>
+              </w:rPr>
+              <w:t xml:space="preserve">ansible-vault rekey secrets.yml</w:t>
+            </w:r>
+            <w:r>
+              <w:t xml:space="preserve"> (asks for the old and new password). Then update the Keychain with the </w:t>
+            </w:r>
+            <w:r>
+              <w:rPr>
+                <w:rFonts w:ascii="Consolas" w:cs="Consolas" w:eastAsia="Consolas" w:hAnsi="Consolas"/>
+                <w:color w:val="1F3A6B"/>
+                <w:sz w:val="19"/>
+                <w:szCs w:val="19"/>
+              </w:rPr>
+              <w:t xml:space="preserve">add-generic-password -U</w:t>
+            </w:r>
+            <w:r>
+              <w:t xml:space="preserve"> command, update the password manager, and commit the re-encrypted </w:t>
+            </w:r>
+            <w:r>
+              <w:rPr>
+                <w:rFonts w:ascii="Consolas" w:cs="Consolas" w:eastAsia="Consolas" w:hAnsi="Consolas"/>
+                <w:color w:val="1F3A6B"/>
+                <w:sz w:val="19"/>
+                <w:szCs w:val="19"/>
+              </w:rPr>
+              <w:t xml:space="preserve">ansible/secrets.yml</w:t>
+            </w:r>
+            <w:r>
+              <w:t xml:space="preserve"> through a pull request. If it may have leaked, also change the secrets inside it.</w:t>
+            </w:r>
+          </w:p>
+        </w:tc>
+      </w:tr>
+      <w:tr>
+        <w:trPr>
+          <w:cantSplit/>
+        </w:trPr>
+        <w:tc>
+          <w:tcPr>
+            <w:tcW w:type="dxa" w:w="2811"/>
+            <w:tcBorders>
+              <w:top w:val="single" w:color="auto" w:sz="4"/>
+              <w:left w:val="single" w:color="auto" w:sz="4"/>
+              <w:bottom w:val="single" w:color="auto" w:sz="4"/>
+              <w:right w:val="single" w:color="auto" w:sz="4"/>
+            </w:tcBorders>
+            <w:tcMar>
+              <w:top w:type="dxa" w:w="60"/>
+              <w:left w:type="dxa" w:w="100"/>
+              <w:bottom w:type="dxa" w:w="60"/>
+              <w:right w:type="dxa" w:w="100"/>
+            </w:tcMar>
+          </w:tcPr>
+          <w:p>
+            <w:r>
+              <w:t xml:space="preserve">Password lost</w:t>
+            </w:r>
+          </w:p>
+        </w:tc>
+        <w:tc>
+          <w:tcPr>
+            <w:tcW w:type="dxa" w:w="6827"/>
+            <w:tcBorders>
+              <w:top w:val="single" w:color="auto" w:sz="4"/>
+              <w:left w:val="single" w:color="auto" w:sz="4"/>
+              <w:bottom w:val="single" w:color="auto" w:sz="4"/>
+              <w:right w:val="single" w:color="auto" w:sz="4"/>
+            </w:tcBorders>
+            <w:tcMar>
+              <w:top w:type="dxa" w:w="60"/>
+              <w:left w:type="dxa" w:w="100"/>
+              <w:bottom w:type="dxa" w:w="60"/>
+              <w:right w:type="dxa" w:w="100"/>
+            </w:tcMar>
+          </w:tcPr>
+          <w:p>
+            <w:r>
+              <w:t xml:space="preserve">The vault cannot be opened, by anyone. The running server keeps working, but no deploy is possible. Recover by reading the current values on the server (</w:t>
+            </w:r>
+            <w:r>
+              <w:rPr>
+                <w:rFonts w:ascii="Consolas" w:cs="Consolas" w:eastAsia="Consolas" w:hAnsi="Consolas"/>
+                <w:color w:val="1F3A6B"/>
+                <w:sz w:val="19"/>
+                <w:szCs w:val="19"/>
+              </w:rPr>
+              <w:t xml:space="preserve">sudo cat /opt/isp-observability/secrets/*</w:t>
+            </w:r>
+            <w:r>
+              <w:t xml:space="preserve">, </w:t>
+            </w:r>
+            <w:r>
+              <w:rPr>
+                <w:rFonts w:ascii="Consolas" w:cs="Consolas" w:eastAsia="Consolas" w:hAnsi="Consolas"/>
+                <w:color w:val="1F3A6B"/>
+                <w:sz w:val="19"/>
+                <w:szCs w:val="19"/>
+              </w:rPr>
+              <w:t xml:space="preserve">routeros_exporter/config.yml</w:t>
+            </w:r>
+            <w:r>
+              <w:t xml:space="preserve">, </w:t>
+            </w:r>
+            <w:r>
+              <w:rPr>
+                <w:rFonts w:ascii="Consolas" w:cs="Consolas" w:eastAsia="Consolas" w:hAnsi="Consolas"/>
+                <w:color w:val="1F3A6B"/>
+                <w:sz w:val="19"/>
+                <w:szCs w:val="19"/>
+              </w:rPr>
+              <w:t xml:space="preserve">.env</w:t>
+            </w:r>
+            <w:r>
+              <w:t xml:space="preserve">, </w:t>
+            </w:r>
+            <w:r>
+              <w:rPr>
+                <w:rFonts w:ascii="Consolas" w:cs="Consolas" w:eastAsia="Consolas" w:hAnsi="Consolas"/>
+                <w:color w:val="1F3A6B"/>
+                <w:sz w:val="19"/>
+                <w:szCs w:val="19"/>
+              </w:rPr>
+              <w:t xml:space="preserve">sudo ufw status</w:t>
+            </w:r>
+            <w:r>
+              <w:t xml:space="preserve">, </w:t>
+            </w:r>
+            <w:r>
+              <w:rPr>
+                <w:rFonts w:ascii="Consolas" w:cs="Consolas" w:eastAsia="Consolas" w:hAnsi="Consolas"/>
+                <w:color w:val="1F3A6B"/>
+                <w:sz w:val="19"/>
+                <w:szCs w:val="19"/>
+              </w:rPr>
+              <w:t xml:space="preserve">sudo iptables -S DOCKER-USER</w:t>
+            </w:r>
+            <w:r>
+              <w:t xml:space="preserve">), moving the old vault aside, setting a new password (6.1) and re-entering every value with </w:t>
+            </w:r>
+            <w:r>
+              <w:rPr>
+                <w:rFonts w:ascii="Consolas" w:cs="Consolas" w:eastAsia="Consolas" w:hAnsi="Consolas"/>
+                <w:color w:val="1F3A6B"/>
+                <w:sz w:val="19"/>
+                <w:szCs w:val="19"/>
+              </w:rPr>
+              <w:t xml:space="preserve">scripts/edit-secrets.sh</w:t>
+            </w:r>
+            <w:r>
+              <w:t xml:space="preserve">. If the server is lost too, every credential must be created again.</w:t>
+            </w:r>
+          </w:p>
+        </w:tc>
+      </w:tr>
+    </w:tbl>
+    <w:p>
+      <w:pPr>
+        <w:spacing w:after="60"/>
+      </w:pPr>
     </w:p>
     <w:p>
       <w:pPr>
@@ -6603,7 +7102,17 @@
           </w:tcPr>
           <w:p>
             <w:r>
-              <w:t xml:space="preserve">Vault password in the Keychain </w:t>
+              <w:t xml:space="preserve">A </w:t>
+            </w:r>
+            <w:r>
+              <w:rPr>
+                <w:b/>
+                <w:bCs/>
+              </w:rPr>
+              <w:t xml:space="preserve">new</w:t>
+            </w:r>
+            <w:r>
+              <w:t xml:space="preserve"> vault password for this installation (not the lab one), in the Keychain </w:t>
             </w:r>
             <w:r>
               <w:rPr>
@@ -12520,6 +13029,64 @@
                 <w:szCs w:val="19"/>
               </w:rPr>
               <w:t xml:space="preserve">scripts/deploy.sh</w:t>
+            </w:r>
+          </w:p>
+        </w:tc>
+      </w:tr>
+      <w:tr>
+        <w:trPr>
+          <w:cantSplit/>
+        </w:trPr>
+        <w:tc>
+          <w:tcPr>
+            <w:tcW w:type="dxa" w:w="3614"/>
+            <w:tcBorders>
+              <w:top w:val="single" w:color="auto" w:sz="4"/>
+              <w:left w:val="single" w:color="auto" w:sz="4"/>
+              <w:bottom w:val="single" w:color="auto" w:sz="4"/>
+              <w:right w:val="single" w:color="auto" w:sz="4"/>
+            </w:tcBorders>
+            <w:tcMar>
+              <w:top w:type="dxa" w:w="60"/>
+              <w:left w:type="dxa" w:w="100"/>
+              <w:bottom w:type="dxa" w:w="60"/>
+              <w:right w:type="dxa" w:w="100"/>
+            </w:tcMar>
+          </w:tcPr>
+          <w:p>
+            <w:r>
+              <w:t xml:space="preserve">Change the vault password</w:t>
+            </w:r>
+          </w:p>
+        </w:tc>
+        <w:tc>
+          <w:tcPr>
+            <w:tcW w:type="dxa" w:w="6024"/>
+            <w:tcBorders>
+              <w:top w:val="single" w:color="auto" w:sz="4"/>
+              <w:left w:val="single" w:color="auto" w:sz="4"/>
+              <w:bottom w:val="single" w:color="auto" w:sz="4"/>
+              <w:right w:val="single" w:color="auto" w:sz="4"/>
+            </w:tcBorders>
+            <w:tcMar>
+              <w:top w:type="dxa" w:w="60"/>
+              <w:left w:type="dxa" w:w="100"/>
+              <w:bottom w:type="dxa" w:w="60"/>
+              <w:right w:type="dxa" w:w="100"/>
+            </w:tcMar>
+          </w:tcPr>
+          <w:p>
+            <w:r>
+              <w:rPr>
+                <w:rFonts w:ascii="Consolas" w:cs="Consolas" w:eastAsia="Consolas" w:hAnsi="Consolas"/>
+                <w:color w:val="1F3A6B"/>
+                <w:sz w:val="19"/>
+                <w:szCs w:val="19"/>
+              </w:rPr>
+              <w:t xml:space="preserve">cd ansible &amp;&amp; ansible-vault rekey secrets.yml</w:t>
+            </w:r>
+            <w:r>
+              <w:t xml:space="preserve">, update Keychain and password manager, commit (section 6.2)</w:t>
             </w:r>
           </w:p>
         </w:tc>

</xml_diff>